<commit_message>
Preview: Oct12 S3 with Fiona's wall-board exercise merged in
Co-Authored-By: Claude Opus 5.5 <noreply@anthropic.com>
</commit_message>
<xml_diff>
--- a/docs/preview/Oct12_session3_materials.docx
+++ b/docs/preview/Oct12_session3_materials.docx
@@ -1366,7 +1366,7 @@
           <w:szCs w:val="18"/>
           <w:color w:val="215A9E"/>
         </w:rPr>
-        <w:t xml:space="preserve">Print: 1 per pair</w:t>
+        <w:t xml:space="preserve">Print: 1 per group (8 groups), plus one green, one yellow and one red marker per group. The claim strips for the wall are at the end of this pack</w:t>
       </w:r>
     </w:p>
     <w:p>
@@ -1460,7 +1460,7 @@
           <w:left w:val="none" w:sz="0" w:space="0" w:color="000000"/>
           <w:right w:val="none" w:sz="0" w:space="0" w:color="000000"/>
         </w:pBdr>
-        <w:spacing w:after="80" w:before="0" w:line="240"/>
+        <w:spacing w:after="60" w:before="0" w:line="240"/>
         <w:ind w:left="0" w:right="0" w:firstLine="0" w:firstLineChars="0"/>
       </w:pPr>
       <w:r>
@@ -1474,7 +1474,250 @@
           <w:szCs w:val="22"/>
           <w:color w:val="000000"/>
         </w:rPr>
-        <w:t xml:space="preserve">The GreenWaste pilot produced a clear result: waste-management costs fell by 670 AED per business, and with p &lt; 0.001 we can be confident the programme caused this reduction. Because the same businesses were measured before and after, differences between businesses are already accounted for, so the 670 AED saving can be attributed to the programme. This makes a strong case for national scale-up. As with any pilot, results should be monitored as the programme expands.</w:t>
+        <w:t xml:space="preserve">1.  The GreenWaste pilot produced a clear result: waste-management costs fell by 670 AED per business,</w:t>
+      </w:r>
+    </w:p>
+    <w:p>
+      <w:pPr>
+        <w:pStyle w:val="Normal"/>
+        <w:jc w:val="left"/>
+        <w:pBdr>
+          <w:bottom w:val="none" w:sz="0" w:space="0" w:color="000000"/>
+          <w:top w:val="none" w:sz="0" w:space="0" w:color="000000"/>
+          <w:left w:val="none" w:sz="0" w:space="0" w:color="000000"/>
+          <w:right w:val="none" w:sz="0" w:space="0" w:color="000000"/>
+        </w:pBdr>
+        <w:spacing w:after="60" w:before="0" w:line="240"/>
+        <w:ind w:left="0" w:right="0" w:firstLine="0" w:firstLineChars="0"/>
+      </w:pPr>
+      <w:r>
+        <w:rPr>
+          <w:rFonts w:ascii="Arial" w:hAnsi="Arial" w:eastAsia="Arial" w:cs="Arial"/>
+          <w:i w:val="false"/>
+          <w:b w:val="false"/>
+          <w:u w:val="none"/>
+          <w:strike w:val="false"/>
+          <w:sz w:val="22"/>
+          <w:szCs w:val="22"/>
+          <w:color w:val="000000"/>
+        </w:rPr>
+        <w:t xml:space="preserve">2.  and with p &lt; 0.001 we can be confident the programme caused this reduction.</w:t>
+      </w:r>
+    </w:p>
+    <w:p>
+      <w:pPr>
+        <w:pStyle w:val="Normal"/>
+        <w:jc w:val="left"/>
+        <w:pBdr>
+          <w:bottom w:val="none" w:sz="0" w:space="0" w:color="000000"/>
+          <w:top w:val="none" w:sz="0" w:space="0" w:color="000000"/>
+          <w:left w:val="none" w:sz="0" w:space="0" w:color="000000"/>
+          <w:right w:val="none" w:sz="0" w:space="0" w:color="000000"/>
+        </w:pBdr>
+        <w:spacing w:after="60" w:before="0" w:line="240"/>
+        <w:ind w:left="0" w:right="0" w:firstLine="0" w:firstLineChars="0"/>
+      </w:pPr>
+      <w:r>
+        <w:rPr>
+          <w:rFonts w:ascii="Arial" w:hAnsi="Arial" w:eastAsia="Arial" w:cs="Arial"/>
+          <w:i w:val="false"/>
+          <w:b w:val="false"/>
+          <w:u w:val="none"/>
+          <w:strike w:val="false"/>
+          <w:sz w:val="22"/>
+          <w:szCs w:val="22"/>
+          <w:color w:val="000000"/>
+        </w:rPr>
+        <w:t xml:space="preserve">3.  Because the same businesses were measured before and after, differences between businesses are already accounted for,</w:t>
+      </w:r>
+    </w:p>
+    <w:p>
+      <w:pPr>
+        <w:pStyle w:val="Normal"/>
+        <w:jc w:val="left"/>
+        <w:pBdr>
+          <w:bottom w:val="none" w:sz="0" w:space="0" w:color="000000"/>
+          <w:top w:val="none" w:sz="0" w:space="0" w:color="000000"/>
+          <w:left w:val="none" w:sz="0" w:space="0" w:color="000000"/>
+          <w:right w:val="none" w:sz="0" w:space="0" w:color="000000"/>
+        </w:pBdr>
+        <w:spacing w:after="60" w:before="0" w:line="240"/>
+        <w:ind w:left="0" w:right="0" w:firstLine="0" w:firstLineChars="0"/>
+      </w:pPr>
+      <w:r>
+        <w:rPr>
+          <w:rFonts w:ascii="Arial" w:hAnsi="Arial" w:eastAsia="Arial" w:cs="Arial"/>
+          <w:i w:val="false"/>
+          <w:b w:val="false"/>
+          <w:u w:val="none"/>
+          <w:strike w:val="false"/>
+          <w:sz w:val="22"/>
+          <w:szCs w:val="22"/>
+          <w:color w:val="000000"/>
+        </w:rPr>
+        <w:t xml:space="preserve">4.  so the 670 AED saving can be attributed to the programme.</w:t>
+      </w:r>
+    </w:p>
+    <w:p>
+      <w:pPr>
+        <w:pStyle w:val="Normal"/>
+        <w:jc w:val="left"/>
+        <w:pBdr>
+          <w:bottom w:val="none" w:sz="0" w:space="0" w:color="000000"/>
+          <w:top w:val="none" w:sz="0" w:space="0" w:color="000000"/>
+          <w:left w:val="none" w:sz="0" w:space="0" w:color="000000"/>
+          <w:right w:val="none" w:sz="0" w:space="0" w:color="000000"/>
+        </w:pBdr>
+        <w:spacing w:after="60" w:before="0" w:line="240"/>
+        <w:ind w:left="0" w:right="0" w:firstLine="0" w:firstLineChars="0"/>
+      </w:pPr>
+      <w:r>
+        <w:rPr>
+          <w:rFonts w:ascii="Arial" w:hAnsi="Arial" w:eastAsia="Arial" w:cs="Arial"/>
+          <w:i w:val="false"/>
+          <w:b w:val="false"/>
+          <w:u w:val="none"/>
+          <w:strike w:val="false"/>
+          <w:sz w:val="22"/>
+          <w:szCs w:val="22"/>
+          <w:color w:val="000000"/>
+        </w:rPr>
+        <w:t xml:space="preserve">5.  This makes a strong case for national scale-up.</w:t>
+      </w:r>
+    </w:p>
+    <w:p>
+      <w:pPr>
+        <w:pStyle w:val="Normal"/>
+        <w:jc w:val="left"/>
+        <w:pBdr>
+          <w:bottom w:val="none" w:sz="0" w:space="0" w:color="000000"/>
+          <w:top w:val="none" w:sz="0" w:space="0" w:color="000000"/>
+          <w:left w:val="none" w:sz="0" w:space="0" w:color="000000"/>
+          <w:right w:val="none" w:sz="0" w:space="0" w:color="000000"/>
+        </w:pBdr>
+        <w:spacing w:after="60" w:before="0" w:line="240"/>
+        <w:ind w:left="0" w:right="0" w:firstLine="0" w:firstLineChars="0"/>
+      </w:pPr>
+      <w:r>
+        <w:rPr>
+          <w:rFonts w:ascii="Arial" w:hAnsi="Arial" w:eastAsia="Arial" w:cs="Arial"/>
+          <w:i w:val="false"/>
+          <w:b w:val="false"/>
+          <w:u w:val="none"/>
+          <w:strike w:val="false"/>
+          <w:sz w:val="22"/>
+          <w:szCs w:val="22"/>
+          <w:color w:val="000000"/>
+        </w:rPr>
+        <w:t xml:space="preserve">6.  As with any pilot, results should be monitored as the programme expands.</w:t>
+      </w:r>
+    </w:p>
+    <w:p>
+      <w:pPr>
+        <w:pStyle w:val="Normal"/>
+        <w:jc w:val="left"/>
+        <w:pBdr>
+          <w:bottom w:val="none" w:sz="0" w:space="0" w:color="000000"/>
+          <w:top w:val="none" w:sz="0" w:space="0" w:color="000000"/>
+          <w:left w:val="none" w:sz="0" w:space="0" w:color="000000"/>
+          <w:right w:val="none" w:sz="0" w:space="0" w:color="000000"/>
+        </w:pBdr>
+        <w:spacing w:after="40" w:before="0" w:line="240"/>
+        <w:ind w:left="0" w:right="0" w:firstLine="0" w:firstLineChars="0"/>
+      </w:pPr>
+      <w:r>
+        <w:rPr>
+          <w:rFonts w:ascii="Arial" w:hAnsi="Arial" w:eastAsia="Arial" w:cs="Arial"/>
+          <w:i w:val="false"/>
+          <w:b w:val="true"/>
+          <w:u w:val="none"/>
+          <w:strike w:val="false"/>
+          <w:sz w:val="22"/>
+          <w:szCs w:val="22"/>
+          <w:color w:val="000000"/>
+        </w:rPr>
+        <w:t xml:space="preserve">Marker rules. At your table, mark each numbered claim with a coloured marker:</w:t>
+      </w:r>
+    </w:p>
+    <w:p>
+      <w:pPr>
+        <w:pStyle w:val="Normal"/>
+        <w:jc w:val="left"/>
+        <w:pBdr>
+          <w:bottom w:val="none" w:sz="0" w:space="0" w:color="000000"/>
+          <w:top w:val="none" w:sz="0" w:space="0" w:color="000000"/>
+          <w:left w:val="none" w:sz="0" w:space="0" w:color="000000"/>
+          <w:right w:val="none" w:sz="0" w:space="0" w:color="000000"/>
+        </w:pBdr>
+        <w:spacing w:after="20" w:before="0" w:line="240"/>
+        <w:ind w:left="0" w:right="0" w:firstLine="0" w:firstLineChars="0"/>
+      </w:pPr>
+      <w:r>
+        <w:rPr>
+          <w:rFonts w:ascii="Arial" w:hAnsi="Arial" w:eastAsia="Arial" w:cs="Arial"/>
+          <w:i w:val="false"/>
+          <w:b w:val="false"/>
+          <w:u w:val="none"/>
+          <w:strike w:val="false"/>
+          <w:sz w:val="22"/>
+          <w:szCs w:val="22"/>
+          <w:color w:val="000000"/>
+        </w:rPr>
+        <w:t xml:space="preserve">    Green: the evidence supports the claim.</w:t>
+      </w:r>
+    </w:p>
+    <w:p>
+      <w:pPr>
+        <w:pStyle w:val="Normal"/>
+        <w:jc w:val="left"/>
+        <w:pBdr>
+          <w:bottom w:val="none" w:sz="0" w:space="0" w:color="000000"/>
+          <w:top w:val="none" w:sz="0" w:space="0" w:color="000000"/>
+          <w:left w:val="none" w:sz="0" w:space="0" w:color="000000"/>
+          <w:right w:val="none" w:sz="0" w:space="0" w:color="000000"/>
+        </w:pBdr>
+        <w:spacing w:after="20" w:before="0" w:line="240"/>
+        <w:ind w:left="0" w:right="0" w:firstLine="0" w:firstLineChars="0"/>
+      </w:pPr>
+      <w:r>
+        <w:rPr>
+          <w:rFonts w:ascii="Arial" w:hAnsi="Arial" w:eastAsia="Arial" w:cs="Arial"/>
+          <w:i w:val="false"/>
+          <w:b w:val="false"/>
+          <w:u w:val="none"/>
+          <w:strike w:val="false"/>
+          <w:sz w:val="22"/>
+          <w:szCs w:val="22"/>
+          <w:color w:val="000000"/>
+        </w:rPr>
+        <w:t xml:space="preserve">    Yellow: partly true, or true but not enough to act on.</w:t>
+      </w:r>
+    </w:p>
+    <w:p>
+      <w:pPr>
+        <w:pStyle w:val="Normal"/>
+        <w:jc w:val="left"/>
+        <w:pBdr>
+          <w:bottom w:val="none" w:sz="0" w:space="0" w:color="000000"/>
+          <w:top w:val="none" w:sz="0" w:space="0" w:color="000000"/>
+          <w:left w:val="none" w:sz="0" w:space="0" w:color="000000"/>
+          <w:right w:val="none" w:sz="0" w:space="0" w:color="000000"/>
+        </w:pBdr>
+        <w:spacing w:after="20" w:before="0" w:line="240"/>
+        <w:ind w:left="0" w:right="0" w:firstLine="0" w:firstLineChars="0"/>
+      </w:pPr>
+      <w:r>
+        <w:rPr>
+          <w:rFonts w:ascii="Arial" w:hAnsi="Arial" w:eastAsia="Arial" w:cs="Arial"/>
+          <w:i w:val="false"/>
+          <w:b w:val="false"/>
+          <w:u w:val="none"/>
+          <w:strike w:val="false"/>
+          <w:sz w:val="22"/>
+          <w:szCs w:val="22"/>
+          <w:color w:val="000000"/>
+        </w:rPr>
+        <w:t xml:space="preserve">    Red: the evidence does not support the claim.</w:t>
       </w:r>
     </w:p>
     <w:p>
@@ -1501,7 +1744,7 @@
           <w:szCs w:val="22"/>
           <w:color w:val="000000"/>
         </w:rPr>
-        <w:t xml:space="preserve">Underline every claim in the response that the evidence does not support. Then run the same prompt yourselves: did your AI write something similar?</w:t>
+        <w:t xml:space="preserve">Then one person from your group takes your colours to the claim strips on the wall and puts one dot on each strip.</w:t>
       </w:r>
     </w:p>
     <w:p>
@@ -1514,21 +1757,21 @@
           <w:left w:val="none" w:sz="0" w:space="0" w:color="000000"/>
           <w:right w:val="none" w:sz="0" w:space="0" w:color="000000"/>
         </w:pBdr>
-        <w:spacing w:after="120" w:before="0" w:line="240"/>
+        <w:spacing w:after="80" w:before="0" w:line="240"/>
         <w:ind w:left="0" w:right="0" w:firstLine="0" w:firstLineChars="0"/>
       </w:pPr>
       <w:r>
         <w:rPr>
           <w:rFonts w:ascii="Arial" w:hAnsi="Arial" w:eastAsia="Arial" w:cs="Arial"/>
           <w:i w:val="false"/>
-          <w:b w:val="false"/>
+          <w:b w:val="true"/>
           <w:u w:val="none"/>
           <w:strike w:val="false"/>
           <w:sz w:val="22"/>
           <w:szCs w:val="22"/>
-          <w:color w:val="B5BEC9"/>
+          <w:color w:val="000000"/>
         </w:rPr>
-        <w:t xml:space="preserve">____________________________________________________________________________</w:t>
+        <w:t xml:space="preserve">Then run the same prompt yourselves: did your AI write something similar?</w:t>
       </w:r>
     </w:p>
     <w:p>
@@ -3186,6 +3429,700 @@
         <w:t xml:space="preserve">1. Significant is not causal: p &lt; 0.001 says the fall is unlikely to be chance, not what caused it. 2. Half right: following the same businesses removes fixed differences but not what changed for everyone. 3. It reports 670 as the effect; the randomised estimate is about 1,014. 4. It recommends scale-up without asking what bar the programme must clear.</w:t>
       </w:r>
     </w:p>
+    <w:p>
+      <w:pPr>
+        <w:pStyle w:val="Normal"/>
+        <w:jc w:val="left"/>
+        <w:pBdr>
+          <w:bottom w:val="none" w:sz="0" w:space="0" w:color="000000"/>
+          <w:top w:val="none" w:sz="0" w:space="0" w:color="000000"/>
+          <w:left w:val="none" w:sz="0" w:space="0" w:color="000000"/>
+          <w:right w:val="none" w:sz="0" w:space="0" w:color="000000"/>
+        </w:pBdr>
+        <w:spacing w:after="60" w:before="0" w:line="240"/>
+        <w:ind w:left="0" w:right="0" w:firstLine="0" w:firstLineChars="0"/>
+      </w:pPr>
+      <w:r>
+        <w:rPr>
+          <w:rFonts w:ascii="Arial" w:hAnsi="Arial" w:eastAsia="Arial" w:cs="Arial"/>
+          <w:i w:val="false"/>
+          <w:b w:val="true"/>
+          <w:u w:val="none"/>
+          <w:strike w:val="false"/>
+          <w:sz w:val="26"/>
+          <w:szCs w:val="26"/>
+          <w:color w:val="215A9E"/>
+        </w:rPr>
+        <w:t xml:space="preserve">AI Snapshot board</w:t>
+      </w:r>
+    </w:p>
+    <w:p>
+      <w:pPr>
+        <w:pStyle w:val="Normal"/>
+        <w:jc w:val="left"/>
+        <w:pBdr>
+          <w:bottom w:val="none" w:sz="0" w:space="0" w:color="000000"/>
+          <w:top w:val="none" w:sz="0" w:space="0" w:color="000000"/>
+          <w:left w:val="none" w:sz="0" w:space="0" w:color="000000"/>
+          <w:right w:val="none" w:sz="0" w:space="0" w:color="000000"/>
+        </w:pBdr>
+        <w:spacing w:after="80" w:before="0" w:line="240"/>
+        <w:ind w:left="0" w:right="0" w:firstLine="0" w:firstLineChars="0"/>
+      </w:pPr>
+      <w:r>
+        <w:rPr>
+          <w:rFonts w:ascii="Arial" w:hAnsi="Arial" w:eastAsia="Arial" w:cs="Arial"/>
+          <w:i w:val="false"/>
+          <w:b w:val="false"/>
+          <w:u w:val="none"/>
+          <w:strike w:val="false"/>
+          <w:sz w:val="22"/>
+          <w:szCs w:val="22"/>
+          <w:color w:val="000000"/>
+        </w:rPr>
+        <w:t xml:space="preserve">Setup, before the session: tape the six claim strips (last pages of this pack) down the wall in order, with space beside each strip for eight dots. Give each group one green, one yellow and one red marker (or dot stickers in the same colours). Groups mark the claims on their handout at the table, then one person per group puts one dot on each strip.</w:t>
+      </w:r>
+    </w:p>
+    <w:p>
+      <w:pPr>
+        <w:pStyle w:val="Normal"/>
+        <w:jc w:val="left"/>
+        <w:pBdr>
+          <w:bottom w:val="none" w:sz="0" w:space="0" w:color="000000"/>
+          <w:top w:val="none" w:sz="0" w:space="0" w:color="000000"/>
+          <w:left w:val="none" w:sz="0" w:space="0" w:color="000000"/>
+          <w:right w:val="none" w:sz="0" w:space="0" w:color="000000"/>
+        </w:pBdr>
+        <w:spacing w:after="80" w:before="0" w:line="240"/>
+        <w:ind w:left="0" w:right="0" w:firstLine="0" w:firstLineChars="0"/>
+      </w:pPr>
+      <w:r>
+        <w:rPr>
+          <w:rFonts w:ascii="Arial" w:hAnsi="Arial" w:eastAsia="Arial" w:cs="Arial"/>
+          <w:i w:val="false"/>
+          <w:b w:val="false"/>
+          <w:u w:val="none"/>
+          <w:strike w:val="false"/>
+          <w:sz w:val="22"/>
+          <w:szCs w:val="22"/>
+          <w:color w:val="000000"/>
+        </w:rPr>
+        <w:t xml:space="preserve">Expected wall: strip 1 mostly green (the fall of 670 AED is in the data). Strips 2, 4 and 5 red. Strip 3 split between yellow and green: it is half right, which is the debrief's error 2, so start the debrief there. Strip 6 green or yellow: true, but a generic caveat that cannot be monitored. Read the wall before showing the debrief slide: ask the groups that disagree on strip 3 to give their reasons.</w:t>
+      </w:r>
+    </w:p>
+    <w:p>
+      <w:pPr/>
+      <w:r>
+        <w:br w:type="page"/>
+      </w:r>
+    </w:p>
+    <w:p>
+      <w:pPr>
+        <w:pStyle w:val="Normal"/>
+        <w:jc w:val="left"/>
+        <w:pBdr>
+          <w:bottom w:val="none" w:sz="0" w:space="0" w:color="000000"/>
+          <w:top w:val="none" w:sz="0" w:space="0" w:color="000000"/>
+          <w:left w:val="none" w:sz="0" w:space="0" w:color="000000"/>
+          <w:right w:val="none" w:sz="0" w:space="0" w:color="000000"/>
+        </w:pBdr>
+        <w:spacing w:after="0" w:before="0" w:line="240"/>
+        <w:ind w:left="0" w:right="0" w:firstLine="0" w:firstLineChars="0"/>
+      </w:pPr>
+      <w:r>
+        <w:rPr>
+          <w:rFonts w:ascii="Arial" w:hAnsi="Arial" w:eastAsia="Arial" w:cs="Arial"/>
+          <w:i w:val="false"/>
+          <w:b w:val="false"/>
+          <w:u w:val="none"/>
+          <w:strike w:val="false"/>
+          <w:sz w:val="18"/>
+          <w:szCs w:val="18"/>
+          <w:color w:val="545860"/>
+        </w:rPr>
+        <w:t xml:space="preserve">Module 2 · Day 1, Session 3 · Spot the Problem</w:t>
+      </w:r>
+    </w:p>
+    <w:p>
+      <w:pPr>
+        <w:pStyle w:val="Normal"/>
+        <w:jc w:val="left"/>
+        <w:pBdr>
+          <w:bottom w:val="none" w:sz="0" w:space="0" w:color="000000"/>
+          <w:top w:val="none" w:sz="0" w:space="0" w:color="000000"/>
+          <w:left w:val="none" w:sz="0" w:space="0" w:color="000000"/>
+          <w:right w:val="none" w:sz="0" w:space="0" w:color="000000"/>
+        </w:pBdr>
+        <w:spacing w:after="40" w:before="0" w:line="240"/>
+        <w:ind w:left="0" w:right="0" w:firstLine="0" w:firstLineChars="0"/>
+      </w:pPr>
+      <w:r>
+        <w:rPr>
+          <w:rFonts w:ascii="Arial" w:hAnsi="Arial" w:eastAsia="Arial" w:cs="Arial"/>
+          <w:i w:val="false"/>
+          <w:b w:val="true"/>
+          <w:u w:val="none"/>
+          <w:strike w:val="false"/>
+          <w:sz w:val="36"/>
+          <w:szCs w:val="36"/>
+          <w:color w:val="063360"/>
+        </w:rPr>
+        <w:t xml:space="preserve">Wall board: claim strips</w:t>
+      </w:r>
+    </w:p>
+    <w:p>
+      <w:pPr>
+        <w:pStyle w:val="Normal"/>
+        <w:jc w:val="left"/>
+        <w:pBdr>
+          <w:bottom w:val="none" w:sz="0" w:space="0" w:color="000000"/>
+          <w:top w:val="none" w:sz="0" w:space="0" w:color="000000"/>
+          <w:left w:val="none" w:sz="0" w:space="0" w:color="000000"/>
+          <w:right w:val="none" w:sz="0" w:space="0" w:color="000000"/>
+        </w:pBdr>
+        <w:spacing w:after="160" w:before="0" w:line="240"/>
+        <w:ind w:left="0" w:right="0" w:firstLine="0" w:firstLineChars="0"/>
+      </w:pPr>
+      <w:r>
+        <w:rPr>
+          <w:rFonts w:ascii="Arial" w:hAnsi="Arial" w:eastAsia="Arial" w:cs="Arial"/>
+          <w:i w:val="true"/>
+          <w:b w:val="false"/>
+          <w:u w:val="none"/>
+          <w:strike w:val="false"/>
+          <w:sz w:val="18"/>
+          <w:szCs w:val="18"/>
+          <w:color w:val="215A9E"/>
+        </w:rPr>
+        <w:t xml:space="preserve">Print: 1 set for the trainer, cut along the dashed lines; tape down the wall in order</w:t>
+      </w:r>
+    </w:p>
+    <w:tbl xmlns:a="http://schemas.openxmlformats.org/drawingml/2006/main" xmlns:pic="http://schemas.openxmlformats.org/drawingml/2006/picture">
+      <w:tblPr>
+        <w:tblLayout w:type="fixed"/>
+        <w:jc w:val="center"/>
+        <w:tblLook w:firstRow="1" w:lastRow="0" w:firstColumn="0" w:lastColumn="0" w:noHBand="0" w:noVBand="1"/>
+      </w:tblPr>
+      <w:tblGrid>
+        <w:gridCol w:w="9792"/>
+      </w:tblGrid>
+      <w:tr>
+        <w:trPr>
+          <w:trHeight w:val="4176" w:hRule="atLeast"/>
+        </w:trPr>
+        body1
+        <w:tc>
+          <w:tcPr>
+            <w:tcBorders>
+              <w:bottom w:val="dashed" w:sz="8" w:space="0" w:color="9AA8B8"/>
+              <w:top w:val="dashed" w:sz="8" w:space="0" w:color="9AA8B8"/>
+              <w:left w:val="dashed" w:sz="8" w:space="0" w:color="9AA8B8"/>
+              <w:right w:val="dashed" w:sz="8" w:space="0" w:color="9AA8B8"/>
+            </w:tcBorders>
+            <w:shd w:val="clear" w:color="auto" w:fill="FFFFFF"/>
+            <w:tcMar>
+              <w:top w:w="0" w:type="dxa"/>
+              <w:bottom w:w="0" w:type="dxa"/>
+              <w:left w:w="0" w:type="dxa"/>
+              <w:right w:w="0" w:type="dxa"/>
+            </w:tcMar>
+            <w:vAlign w:val="center"/>
+          </w:tcPr>
+          <w:p>
+            <w:pPr>
+              <w:jc w:val="center"/>
+              <w:pBdr>
+                <w:bottom w:val="none" w:sz="0" w:space="0" w:color="000000"/>
+                <w:top w:val="none" w:sz="0" w:space="0" w:color="000000"/>
+                <w:left w:val="none" w:sz="0" w:space="0" w:color="000000"/>
+                <w:right w:val="none" w:sz="0" w:space="0" w:color="000000"/>
+              </w:pBdr>
+              <w:spacing w:after="240" w:before="240" w:line="276"/>
+              <w:ind w:left="240" w:right="240" w:firstLine="0" w:firstLineChars="0"/>
+              <w:rPr>
+                <w:rFonts w:ascii="Arial" w:hAnsi="Arial" w:eastAsia="Arial" w:cs="Arial"/>
+                <w:i w:val="false"/>
+                <w:b w:val="false"/>
+                <w:u w:val="none"/>
+                <w:strike w:val="false"/>
+                <w:sz w:val="21"/>
+                <w:szCs w:val="21"/>
+                <w:color w:val="000000"/>
+              </w:rPr>
+            </w:pPr>
+            <w:r>
+              <w:rPr>
+                <w:rFonts w:ascii="Arial" w:hAnsi="Arial" w:eastAsia="Arial" w:cs="Arial"/>
+                <w:i w:val="false"/>
+                <w:b w:val="false"/>
+                <w:u w:val="none"/>
+                <w:strike w:val="false"/>
+                <w:sz w:val="24"/>
+                <w:szCs w:val="24"/>
+                <w:color w:val="545860"/>
+              </w:rPr>
+              <w:t xml:space="preserve">Claim 1</w:t>
+            </w:r>
+            <w:r>
+              <w:rPr>
+                <w:rFonts w:ascii="Arial" w:hAnsi="Arial" w:eastAsia="Arial" w:cs="Arial"/>
+                <w:i w:val="false"/>
+                <w:b w:val="false"/>
+                <w:u w:val="none"/>
+                <w:strike w:val="false"/>
+                <w:sz w:val="24"/>
+                <w:szCs w:val="24"/>
+                <w:color w:val="545860"/>
+              </w:rPr>
+              <w:br/>
+            </w:r>
+            <w:r>
+              <w:rPr>
+                <w:rFonts w:ascii="Arial" w:hAnsi="Arial" w:eastAsia="Arial" w:cs="Arial"/>
+                <w:i w:val="false"/>
+                <w:b w:val="true"/>
+                <w:u w:val="none"/>
+                <w:strike w:val="false"/>
+                <w:sz w:val="52"/>
+                <w:szCs w:val="52"/>
+                <w:color w:val="063360"/>
+              </w:rPr>
+              <w:t xml:space="preserve">The GreenWaste pilot produced a clear result: waste-management costs fell by 670 AED per business,</w:t>
+            </w:r>
+          </w:p>
+        </w:tc>
+      </w:tr>
+      <w:tr>
+        <w:trPr>
+          <w:trHeight w:val="4176" w:hRule="atLeast"/>
+        </w:trPr>
+        body2
+        <w:tc>
+          <w:tcPr>
+            <w:tcBorders>
+              <w:bottom w:val="dashed" w:sz="8" w:space="0" w:color="9AA8B8"/>
+              <w:top w:val="dashed" w:sz="8" w:space="0" w:color="9AA8B8"/>
+              <w:left w:val="dashed" w:sz="8" w:space="0" w:color="9AA8B8"/>
+              <w:right w:val="dashed" w:sz="8" w:space="0" w:color="9AA8B8"/>
+            </w:tcBorders>
+            <w:shd w:val="clear" w:color="auto" w:fill="FFFFFF"/>
+            <w:tcMar>
+              <w:top w:w="0" w:type="dxa"/>
+              <w:bottom w:w="0" w:type="dxa"/>
+              <w:left w:w="0" w:type="dxa"/>
+              <w:right w:w="0" w:type="dxa"/>
+            </w:tcMar>
+            <w:vAlign w:val="center"/>
+          </w:tcPr>
+          <w:p>
+            <w:pPr>
+              <w:jc w:val="center"/>
+              <w:pBdr>
+                <w:bottom w:val="none" w:sz="0" w:space="0" w:color="000000"/>
+                <w:top w:val="none" w:sz="0" w:space="0" w:color="000000"/>
+                <w:left w:val="none" w:sz="0" w:space="0" w:color="000000"/>
+                <w:right w:val="none" w:sz="0" w:space="0" w:color="000000"/>
+              </w:pBdr>
+              <w:spacing w:after="240" w:before="240" w:line="276"/>
+              <w:ind w:left="240" w:right="240" w:firstLine="0" w:firstLineChars="0"/>
+              <w:rPr>
+                <w:rFonts w:ascii="Arial" w:hAnsi="Arial" w:eastAsia="Arial" w:cs="Arial"/>
+                <w:i w:val="false"/>
+                <w:b w:val="false"/>
+                <w:u w:val="none"/>
+                <w:strike w:val="false"/>
+                <w:sz w:val="21"/>
+                <w:szCs w:val="21"/>
+                <w:color w:val="000000"/>
+              </w:rPr>
+            </w:pPr>
+            <w:r>
+              <w:rPr>
+                <w:rFonts w:ascii="Arial" w:hAnsi="Arial" w:eastAsia="Arial" w:cs="Arial"/>
+                <w:i w:val="false"/>
+                <w:b w:val="false"/>
+                <w:u w:val="none"/>
+                <w:strike w:val="false"/>
+                <w:sz w:val="24"/>
+                <w:szCs w:val="24"/>
+                <w:color w:val="545860"/>
+              </w:rPr>
+              <w:t xml:space="preserve">Claim 2</w:t>
+            </w:r>
+            <w:r>
+              <w:rPr>
+                <w:rFonts w:ascii="Arial" w:hAnsi="Arial" w:eastAsia="Arial" w:cs="Arial"/>
+                <w:i w:val="false"/>
+                <w:b w:val="false"/>
+                <w:u w:val="none"/>
+                <w:strike w:val="false"/>
+                <w:sz w:val="24"/>
+                <w:szCs w:val="24"/>
+                <w:color w:val="545860"/>
+              </w:rPr>
+              <w:br/>
+            </w:r>
+            <w:r>
+              <w:rPr>
+                <w:rFonts w:ascii="Arial" w:hAnsi="Arial" w:eastAsia="Arial" w:cs="Arial"/>
+                <w:i w:val="false"/>
+                <w:b w:val="true"/>
+                <w:u w:val="none"/>
+                <w:strike w:val="false"/>
+                <w:sz w:val="52"/>
+                <w:szCs w:val="52"/>
+                <w:color w:val="063360"/>
+              </w:rPr>
+              <w:t xml:space="preserve">and with p &lt; 0.001 we can be confident the programme caused this reduction.</w:t>
+            </w:r>
+          </w:p>
+        </w:tc>
+      </w:tr>
+      <w:tr>
+        <w:trPr>
+          <w:trHeight w:val="4176" w:hRule="atLeast"/>
+        </w:trPr>
+        body3
+        <w:tc>
+          <w:tcPr>
+            <w:tcBorders>
+              <w:bottom w:val="dashed" w:sz="8" w:space="0" w:color="9AA8B8"/>
+              <w:top w:val="dashed" w:sz="8" w:space="0" w:color="9AA8B8"/>
+              <w:left w:val="dashed" w:sz="8" w:space="0" w:color="9AA8B8"/>
+              <w:right w:val="dashed" w:sz="8" w:space="0" w:color="9AA8B8"/>
+            </w:tcBorders>
+            <w:shd w:val="clear" w:color="auto" w:fill="FFFFFF"/>
+            <w:tcMar>
+              <w:top w:w="0" w:type="dxa"/>
+              <w:bottom w:w="0" w:type="dxa"/>
+              <w:left w:w="0" w:type="dxa"/>
+              <w:right w:w="0" w:type="dxa"/>
+            </w:tcMar>
+            <w:vAlign w:val="center"/>
+          </w:tcPr>
+          <w:p>
+            <w:pPr>
+              <w:jc w:val="center"/>
+              <w:pBdr>
+                <w:bottom w:val="none" w:sz="0" w:space="0" w:color="000000"/>
+                <w:top w:val="none" w:sz="0" w:space="0" w:color="000000"/>
+                <w:left w:val="none" w:sz="0" w:space="0" w:color="000000"/>
+                <w:right w:val="none" w:sz="0" w:space="0" w:color="000000"/>
+              </w:pBdr>
+              <w:spacing w:after="240" w:before="240" w:line="276"/>
+              <w:ind w:left="240" w:right="240" w:firstLine="0" w:firstLineChars="0"/>
+              <w:rPr>
+                <w:rFonts w:ascii="Arial" w:hAnsi="Arial" w:eastAsia="Arial" w:cs="Arial"/>
+                <w:i w:val="false"/>
+                <w:b w:val="false"/>
+                <w:u w:val="none"/>
+                <w:strike w:val="false"/>
+                <w:sz w:val="21"/>
+                <w:szCs w:val="21"/>
+                <w:color w:val="000000"/>
+              </w:rPr>
+            </w:pPr>
+            <w:r>
+              <w:rPr>
+                <w:rFonts w:ascii="Arial" w:hAnsi="Arial" w:eastAsia="Arial" w:cs="Arial"/>
+                <w:i w:val="false"/>
+                <w:b w:val="false"/>
+                <w:u w:val="none"/>
+                <w:strike w:val="false"/>
+                <w:sz w:val="24"/>
+                <w:szCs w:val="24"/>
+                <w:color w:val="545860"/>
+              </w:rPr>
+              <w:t xml:space="preserve">Claim 3</w:t>
+            </w:r>
+            <w:r>
+              <w:rPr>
+                <w:rFonts w:ascii="Arial" w:hAnsi="Arial" w:eastAsia="Arial" w:cs="Arial"/>
+                <w:i w:val="false"/>
+                <w:b w:val="false"/>
+                <w:u w:val="none"/>
+                <w:strike w:val="false"/>
+                <w:sz w:val="24"/>
+                <w:szCs w:val="24"/>
+                <w:color w:val="545860"/>
+              </w:rPr>
+              <w:br/>
+            </w:r>
+            <w:r>
+              <w:rPr>
+                <w:rFonts w:ascii="Arial" w:hAnsi="Arial" w:eastAsia="Arial" w:cs="Arial"/>
+                <w:i w:val="false"/>
+                <w:b w:val="true"/>
+                <w:u w:val="none"/>
+                <w:strike w:val="false"/>
+                <w:sz w:val="52"/>
+                <w:szCs w:val="52"/>
+                <w:color w:val="063360"/>
+              </w:rPr>
+              <w:t xml:space="preserve">Because the same businesses were measured before and after, differences between businesses are already accounted for,</w:t>
+            </w:r>
+          </w:p>
+        </w:tc>
+      </w:tr>
+      <w:tr>
+        <w:trPr>
+          <w:trHeight w:val="4176" w:hRule="atLeast"/>
+        </w:trPr>
+        body4
+        <w:tc>
+          <w:tcPr>
+            <w:tcBorders>
+              <w:bottom w:val="dashed" w:sz="8" w:space="0" w:color="9AA8B8"/>
+              <w:top w:val="dashed" w:sz="8" w:space="0" w:color="9AA8B8"/>
+              <w:left w:val="dashed" w:sz="8" w:space="0" w:color="9AA8B8"/>
+              <w:right w:val="dashed" w:sz="8" w:space="0" w:color="9AA8B8"/>
+            </w:tcBorders>
+            <w:shd w:val="clear" w:color="auto" w:fill="FFFFFF"/>
+            <w:tcMar>
+              <w:top w:w="0" w:type="dxa"/>
+              <w:bottom w:w="0" w:type="dxa"/>
+              <w:left w:w="0" w:type="dxa"/>
+              <w:right w:w="0" w:type="dxa"/>
+            </w:tcMar>
+            <w:vAlign w:val="center"/>
+          </w:tcPr>
+          <w:p>
+            <w:pPr>
+              <w:jc w:val="center"/>
+              <w:pBdr>
+                <w:bottom w:val="none" w:sz="0" w:space="0" w:color="000000"/>
+                <w:top w:val="none" w:sz="0" w:space="0" w:color="000000"/>
+                <w:left w:val="none" w:sz="0" w:space="0" w:color="000000"/>
+                <w:right w:val="none" w:sz="0" w:space="0" w:color="000000"/>
+              </w:pBdr>
+              <w:spacing w:after="240" w:before="240" w:line="276"/>
+              <w:ind w:left="240" w:right="240" w:firstLine="0" w:firstLineChars="0"/>
+              <w:rPr>
+                <w:rFonts w:ascii="Arial" w:hAnsi="Arial" w:eastAsia="Arial" w:cs="Arial"/>
+                <w:i w:val="false"/>
+                <w:b w:val="false"/>
+                <w:u w:val="none"/>
+                <w:strike w:val="false"/>
+                <w:sz w:val="21"/>
+                <w:szCs w:val="21"/>
+                <w:color w:val="000000"/>
+              </w:rPr>
+            </w:pPr>
+            <w:r>
+              <w:rPr>
+                <w:rFonts w:ascii="Arial" w:hAnsi="Arial" w:eastAsia="Arial" w:cs="Arial"/>
+                <w:i w:val="false"/>
+                <w:b w:val="false"/>
+                <w:u w:val="none"/>
+                <w:strike w:val="false"/>
+                <w:sz w:val="24"/>
+                <w:szCs w:val="24"/>
+                <w:color w:val="545860"/>
+              </w:rPr>
+              <w:t xml:space="preserve">Claim 4</w:t>
+            </w:r>
+            <w:r>
+              <w:rPr>
+                <w:rFonts w:ascii="Arial" w:hAnsi="Arial" w:eastAsia="Arial" w:cs="Arial"/>
+                <w:i w:val="false"/>
+                <w:b w:val="false"/>
+                <w:u w:val="none"/>
+                <w:strike w:val="false"/>
+                <w:sz w:val="24"/>
+                <w:szCs w:val="24"/>
+                <w:color w:val="545860"/>
+              </w:rPr>
+              <w:br/>
+            </w:r>
+            <w:r>
+              <w:rPr>
+                <w:rFonts w:ascii="Arial" w:hAnsi="Arial" w:eastAsia="Arial" w:cs="Arial"/>
+                <w:i w:val="false"/>
+                <w:b w:val="true"/>
+                <w:u w:val="none"/>
+                <w:strike w:val="false"/>
+                <w:sz w:val="52"/>
+                <w:szCs w:val="52"/>
+                <w:color w:val="063360"/>
+              </w:rPr>
+              <w:t xml:space="preserve">so the 670 AED saving can be attributed to the programme.</w:t>
+            </w:r>
+          </w:p>
+        </w:tc>
+      </w:tr>
+      <w:tr>
+        <w:trPr>
+          <w:trHeight w:val="4176" w:hRule="atLeast"/>
+        </w:trPr>
+        body5
+        <w:tc>
+          <w:tcPr>
+            <w:tcBorders>
+              <w:bottom w:val="dashed" w:sz="8" w:space="0" w:color="9AA8B8"/>
+              <w:top w:val="dashed" w:sz="8" w:space="0" w:color="9AA8B8"/>
+              <w:left w:val="dashed" w:sz="8" w:space="0" w:color="9AA8B8"/>
+              <w:right w:val="dashed" w:sz="8" w:space="0" w:color="9AA8B8"/>
+            </w:tcBorders>
+            <w:shd w:val="clear" w:color="auto" w:fill="FFFFFF"/>
+            <w:tcMar>
+              <w:top w:w="0" w:type="dxa"/>
+              <w:bottom w:w="0" w:type="dxa"/>
+              <w:left w:w="0" w:type="dxa"/>
+              <w:right w:w="0" w:type="dxa"/>
+            </w:tcMar>
+            <w:vAlign w:val="center"/>
+          </w:tcPr>
+          <w:p>
+            <w:pPr>
+              <w:jc w:val="center"/>
+              <w:pBdr>
+                <w:bottom w:val="none" w:sz="0" w:space="0" w:color="000000"/>
+                <w:top w:val="none" w:sz="0" w:space="0" w:color="000000"/>
+                <w:left w:val="none" w:sz="0" w:space="0" w:color="000000"/>
+                <w:right w:val="none" w:sz="0" w:space="0" w:color="000000"/>
+              </w:pBdr>
+              <w:spacing w:after="240" w:before="240" w:line="276"/>
+              <w:ind w:left="240" w:right="240" w:firstLine="0" w:firstLineChars="0"/>
+              <w:rPr>
+                <w:rFonts w:ascii="Arial" w:hAnsi="Arial" w:eastAsia="Arial" w:cs="Arial"/>
+                <w:i w:val="false"/>
+                <w:b w:val="false"/>
+                <w:u w:val="none"/>
+                <w:strike w:val="false"/>
+                <w:sz w:val="21"/>
+                <w:szCs w:val="21"/>
+                <w:color w:val="000000"/>
+              </w:rPr>
+            </w:pPr>
+            <w:r>
+              <w:rPr>
+                <w:rFonts w:ascii="Arial" w:hAnsi="Arial" w:eastAsia="Arial" w:cs="Arial"/>
+                <w:i w:val="false"/>
+                <w:b w:val="false"/>
+                <w:u w:val="none"/>
+                <w:strike w:val="false"/>
+                <w:sz w:val="24"/>
+                <w:szCs w:val="24"/>
+                <w:color w:val="545860"/>
+              </w:rPr>
+              <w:t xml:space="preserve">Claim 5</w:t>
+            </w:r>
+            <w:r>
+              <w:rPr>
+                <w:rFonts w:ascii="Arial" w:hAnsi="Arial" w:eastAsia="Arial" w:cs="Arial"/>
+                <w:i w:val="false"/>
+                <w:b w:val="false"/>
+                <w:u w:val="none"/>
+                <w:strike w:val="false"/>
+                <w:sz w:val="24"/>
+                <w:szCs w:val="24"/>
+                <w:color w:val="545860"/>
+              </w:rPr>
+              <w:br/>
+            </w:r>
+            <w:r>
+              <w:rPr>
+                <w:rFonts w:ascii="Arial" w:hAnsi="Arial" w:eastAsia="Arial" w:cs="Arial"/>
+                <w:i w:val="false"/>
+                <w:b w:val="true"/>
+                <w:u w:val="none"/>
+                <w:strike w:val="false"/>
+                <w:sz w:val="52"/>
+                <w:szCs w:val="52"/>
+                <w:color w:val="063360"/>
+              </w:rPr>
+              <w:t xml:space="preserve">This makes a strong case for national scale-up.</w:t>
+            </w:r>
+          </w:p>
+        </w:tc>
+      </w:tr>
+      <w:tr>
+        <w:trPr>
+          <w:trHeight w:val="4176" w:hRule="atLeast"/>
+        </w:trPr>
+        body6
+        <w:tc>
+          <w:tcPr>
+            <w:tcBorders>
+              <w:bottom w:val="dashed" w:sz="8" w:space="0" w:color="9AA8B8"/>
+              <w:top w:val="dashed" w:sz="8" w:space="0" w:color="9AA8B8"/>
+              <w:left w:val="dashed" w:sz="8" w:space="0" w:color="9AA8B8"/>
+              <w:right w:val="dashed" w:sz="8" w:space="0" w:color="9AA8B8"/>
+            </w:tcBorders>
+            <w:shd w:val="clear" w:color="auto" w:fill="FFFFFF"/>
+            <w:tcMar>
+              <w:top w:w="0" w:type="dxa"/>
+              <w:bottom w:w="0" w:type="dxa"/>
+              <w:left w:w="0" w:type="dxa"/>
+              <w:right w:w="0" w:type="dxa"/>
+            </w:tcMar>
+            <w:vAlign w:val="center"/>
+          </w:tcPr>
+          <w:p>
+            <w:pPr>
+              <w:jc w:val="center"/>
+              <w:pBdr>
+                <w:bottom w:val="none" w:sz="0" w:space="0" w:color="000000"/>
+                <w:top w:val="none" w:sz="0" w:space="0" w:color="000000"/>
+                <w:left w:val="none" w:sz="0" w:space="0" w:color="000000"/>
+                <w:right w:val="none" w:sz="0" w:space="0" w:color="000000"/>
+              </w:pBdr>
+              <w:spacing w:after="240" w:before="240" w:line="276"/>
+              <w:ind w:left="240" w:right="240" w:firstLine="0" w:firstLineChars="0"/>
+              <w:rPr>
+                <w:rFonts w:ascii="Arial" w:hAnsi="Arial" w:eastAsia="Arial" w:cs="Arial"/>
+                <w:i w:val="false"/>
+                <w:b w:val="false"/>
+                <w:u w:val="none"/>
+                <w:strike w:val="false"/>
+                <w:sz w:val="21"/>
+                <w:szCs w:val="21"/>
+                <w:color w:val="000000"/>
+              </w:rPr>
+            </w:pPr>
+            <w:r>
+              <w:rPr>
+                <w:rFonts w:ascii="Arial" w:hAnsi="Arial" w:eastAsia="Arial" w:cs="Arial"/>
+                <w:i w:val="false"/>
+                <w:b w:val="false"/>
+                <w:u w:val="none"/>
+                <w:strike w:val="false"/>
+                <w:sz w:val="24"/>
+                <w:szCs w:val="24"/>
+                <w:color w:val="545860"/>
+              </w:rPr>
+              <w:t xml:space="preserve">Claim 6</w:t>
+            </w:r>
+            <w:r>
+              <w:rPr>
+                <w:rFonts w:ascii="Arial" w:hAnsi="Arial" w:eastAsia="Arial" w:cs="Arial"/>
+                <w:i w:val="false"/>
+                <w:b w:val="false"/>
+                <w:u w:val="none"/>
+                <w:strike w:val="false"/>
+                <w:sz w:val="24"/>
+                <w:szCs w:val="24"/>
+                <w:color w:val="545860"/>
+              </w:rPr>
+              <w:br/>
+            </w:r>
+            <w:r>
+              <w:rPr>
+                <w:rFonts w:ascii="Arial" w:hAnsi="Arial" w:eastAsia="Arial" w:cs="Arial"/>
+                <w:i w:val="false"/>
+                <w:b w:val="true"/>
+                <w:u w:val="none"/>
+                <w:strike w:val="false"/>
+                <w:sz w:val="52"/>
+                <w:szCs w:val="52"/>
+                <w:color w:val="063360"/>
+              </w:rPr>
+              <w:t xml:space="preserve">As with any pilot, results should be monitored as the programme expands.</w:t>
+            </w:r>
+          </w:p>
+        </w:tc>
+      </w:tr>
+    </w:tbl>
     <w:sectPr>
       <w:pgMar w:header="708" w:bottom="1008" w:top="1008" w:right="1152" w:left="1152" w:footer="708" w:gutter="0"/>
       <w:pgSz w:h="16838" w:w="11906" w:orient="portrait"/>

</xml_diff>

<commit_message>
Preview: Day 1 on the simple GreenWaste case (Oct12 S1, S2, S3 and packs)
Co-Authored-By: Claude Opus 5.5 <noreply@anthropic.com>
</commit_message>
<xml_diff>
--- a/docs/preview/Oct12_session3_materials.docx
+++ b/docs/preview/Oct12_session3_materials.docx
@@ -3345,7 +3345,7 @@
           <w:szCs w:val="22"/>
           <w:color w:val="000000"/>
         </w:rPr>
-        <w:t xml:space="preserve">Before and after -670: too small; costs for city businesses that did not take part rose about 148 AED, so the fall understates the effect. Took part vs did not -1,503: too big; the groups differed by -685 AED before the programme. Randomised -1,014: fair. 95% interval -1,086 to -941: the estimate clears 1,000, the interval spans it.</w:t>
+        <w:t xml:space="preserve">Before and after -670: too small; costs for city businesses that did not take part rose about 144 AED, so the fall understates the effect. Took part vs did not -1,639: too big; the groups differed by -825 AED before the programme. Randomised -1,014: fair. 95% interval -1,167 to -862: the estimate clears 1,000, the interval spans it.</w:t>
       </w:r>
     </w:p>
     <w:p>
@@ -3372,7 +3372,7 @@
           <w:szCs w:val="22"/>
           <w:color w:val="000000"/>
         </w:rPr>
-        <w:t xml:space="preserve">Lottery: random draws among the 400 pilot businesses start within a few dozen AED; officials picking the cheapest-to-run businesses start about 436 AED apart. 4 businesses: about ± 538 AED; 400: about ± 55 AED.</w:t>
+        <w:t xml:space="preserve">Lottery: random draws among the 400 pilot businesses start within a few dozen AED; officials picking the cheapest-to-run businesses start about 749 AED apart. 4 businesses: about ± 952 AED; 400: about ± 95 AED.</w:t>
       </w:r>
     </w:p>
     <w:p>

</xml_diff>